<commit_message>
docs: post-merge currency — body linter shipped (677 tests / 97 files)
README (counts + Check-button linter under the editor section), spec §7.5 +
counts, roadmap article §5.1 outcome + TL;DR + verification table, security-
audit delta totals, CHANGELOG post-0.2.0 entry; both Word editions rebuilt.
</commit_message>
<xml_diff>
--- a/docs/ICJIA-Research-Hub-Studio-2026-Analysis-and-Launch-Roadmap.docx
+++ b/docs/ICJIA-Research-Hub-Studio-2026-Analysis-and-Launch-Roadmap.docx
@@ -1245,7 +1245,7 @@
           <w:b/>
           <w:bCs/>
         </w:rPr>
-        <w:t xml:space="preserve">661 automated checks pass on every change</w:t>
+        <w:t xml:space="preserve">677 automated checks pass on every change</w:t>
       </w:r>
       <w:r>
         <w:t xml:space="preserve">, and</w:t>
@@ -1391,7 +1391,7 @@
         <w:t xml:space="preserve"> </w:t>
       </w:r>
       <w:r>
-        <w:t xml:space="preserve">A short list of inexpensive improvements — three were finished the same day as this review; the most important ones remaining protect authors from losing unsaved work. One already-finished feature (a draft-checking tool) was rescued from an accidentally deleted branch and awaits a go/no-go (§5.1).</w:t>
+        <w:t xml:space="preserve">A short list of inexpensive improvements — three were finished the same day as this review; the most important ones remaining protect authors from losing unsaved work. One already-finished feature (a draft-checking tool) was rescued from an accidentally deleted branch and has since been merged (§5.1).</w:t>
       </w:r>
     </w:p>
     <w:p>
@@ -1425,7 +1425,7 @@
           <w:i/>
           <w:iCs/>
         </w:rPr>
-        <w:t xml:space="preserve">Verified July 11, 2026: 661/661 tests passing, clean type check, WCAG 2.1 AA accessible in light and dark, four audits with zero open critical/high/medium findings. The full design specification is Appendix A.</w:t>
+        <w:t xml:space="preserve">Verified July 11, 2026: 677/677 tests passing, clean type check, WCAG 2.1 AA accessible in light and dark, four audits with zero open critical/high/medium findings. The full design specification is Appendix A.</w:t>
       </w:r>
     </w:p>
     <w:p>
@@ -2071,13 +2071,29 @@
                 <w:b/>
                 <w:bCs/>
               </w:rPr>
-              <w:t xml:space="preserve">661 / 96 — all passing</w:t>
+              <w:t xml:space="preserve">661 / 96</w:t>
             </w:r>
             <w:r>
               <w:t xml:space="preserve"> </w:t>
             </w:r>
             <w:r>
-              <w:t xml:space="preserve">after the same-day §5.2 items landed</w:t>
+              <w:t xml:space="preserve">after the same-day §5.2 items;</w:t>
+            </w:r>
+            <w:r>
+              <w:t xml:space="preserve"> </w:t>
+            </w:r>
+            <w:r>
+              <w:rPr>
+                <w:b/>
+                <w:bCs/>
+              </w:rPr>
+              <w:t xml:space="preserve">677 / 97 — all passing</w:t>
+            </w:r>
+            <w:r>
+              <w:t xml:space="preserve"> </w:t>
+            </w:r>
+            <w:r>
+              <w:t xml:space="preserve">after the linter-branch merge later that day</w:t>
             </w:r>
           </w:p>
         </w:tc>
@@ -2343,7 +2359,7 @@
           <w:i/>
           <w:iCs/>
         </w:rPr>
-        <w:t xml:space="preserve">(Small drift note, since resolved: the README advertised 647 tests against an actual 649 at assessment time; the same-day documentation pass brought the README, spec, audit log, and runbook current at 661.)</w:t>
+        <w:t xml:space="preserve">(Small drift note, since resolved: the README advertised 647 tests against an actual 649 at assessment time; the same-day documentation pass brought the README, spec, audit log, and runbook current — refreshed to 677 after the linter merge.)</w:t>
       </w:r>
     </w:p>
     <w:bookmarkEnd w:id="15"/>
@@ -2469,7 +2485,7 @@
         <w:t xml:space="preserve"> </w:t>
       </w:r>
       <w:r>
-        <w:t xml:space="preserve">Validators, mappers, the URL allowlist, the markdown pipeline, annotation anchoring/layout math — all plain TypeScript with no framework dependency, which is why 661 tests run in ten seconds and why the audit could verify behavior by reading small, focused modules.</w:t>
+        <w:t xml:space="preserve">Validators, mappers, the URL allowlist, the markdown pipeline, annotation anchoring/layout math — all plain TypeScript with no framework dependency, which is why 677 tests run in ten seconds and why the audit could verify behavior by reading small, focused modules.</w:t>
       </w:r>
     </w:p>
     <w:p>
@@ -2833,6 +2849,71 @@
           <w:iCs/>
         </w:rPr>
         <w:t xml:space="preserve">Effort: half a day including re-review.</w:t>
+      </w:r>
+    </w:p>
+    <w:p>
+      <w:pPr>
+        <w:pStyle w:val="BodyText"/>
+      </w:pPr>
+      <w:r>
+        <w:rPr>
+          <w:b/>
+          <w:bCs/>
+        </w:rPr>
+        <w:t xml:space="preserve">Outcome (2026-07-11, later the same day):</w:t>
+      </w:r>
+      <w:r>
+        <w:t xml:space="preserve"> </w:t>
+      </w:r>
+      <w:r>
+        <w:t xml:space="preserve">the branch was pushed to the remote and then</w:t>
+      </w:r>
+      <w:r>
+        <w:t xml:space="preserve"> </w:t>
+      </w:r>
+      <w:r>
+        <w:rPr>
+          <w:b/>
+          <w:bCs/>
+        </w:rPr>
+        <w:t xml:space="preserve">merged to</w:t>
+      </w:r>
+      <w:r>
+        <w:rPr>
+          <w:b/>
+          <w:bCs/>
+        </w:rPr>
+        <w:t xml:space="preserve"> </w:t>
+      </w:r>
+      <w:r>
+        <w:rPr>
+          <w:rStyle w:val="VerbatimChar"/>
+          <w:b/>
+          <w:bCs/>
+        </w:rPr>
+        <w:t xml:space="preserve">main</w:t>
+      </w:r>
+      <w:r>
+        <w:t xml:space="preserve"> </w:t>
+      </w:r>
+      <w:r>
+        <w:t xml:space="preserve">by user decision; the merged tree passes</w:t>
+      </w:r>
+      <w:r>
+        <w:t xml:space="preserve"> </w:t>
+      </w:r>
+      <w:r>
+        <w:rPr>
+          <w:b/>
+          <w:bCs/>
+        </w:rPr>
+        <w:t xml:space="preserve">677/677 tests (97 files)</w:t>
+      </w:r>
+      <w:r>
+        <w:t xml:space="preserve"> </w:t>
+      </w:r>
+      <w:r>
+        <w:t xml:space="preserve">with a clean typecheck, and the Check-button linter now ships in the editor.</w:t>
       </w:r>
     </w:p>
     <w:bookmarkEnd w:id="19"/>
@@ -4196,7 +4277,7 @@
         <w:t xml:space="preserve"> </w:t>
       </w:r>
       <w:r>
-        <w:t xml:space="preserve">All 661 tests are unit/component tests; none drive a real browser. A ~5-flow Playwright suite (login → draft → save → preview → annotate → publish) would automate the cutover smoke checklist and catch the class of bug unit tests structurally miss — exemplified by the July 5</w:t>
+        <w:t xml:space="preserve">All 677 tests are unit/component tests; none drive a real browser. A ~5-flow Playwright suite (login → draft → save → preview → annotate → publish) would automate the cutover smoke checklist and catch the class of bug unit tests structurally miss — exemplified by the July 5</w:t>
       </w:r>
       <w:r>
         <w:t xml:space="preserve"> </w:t>
@@ -6296,7 +6377,7 @@
         </w:r>
       </w:hyperlink>
       <w:r>
-        <w:t xml:space="preserve">) is the same audited, 661-test application that will go live, and the remaining distance to launch is measured in configuration and checklists, not code. The analysis found no blockers — it found the gaps a project has</w:t>
+        <w:t xml:space="preserve">) is the same audited, 677-test application that will go live, and the remaining distance to launch is measured in configuration and checklists, not code. The analysis found no blockers — it found the gaps a project has</w:t>
       </w:r>
       <w:r>
         <w:t xml:space="preserve"> </w:t>
@@ -6330,17 +6411,7 @@
         <w:t xml:space="preserve"> </w:t>
       </w:r>
       <w:r>
-        <w:t xml:space="preserve">merge-or-decide the recovered linter branch and push it (the one §5.2 item still open); push today's work so CI runs its first build; and hand the Strapi/Mailgun owners their Phase 1 checklists so the preparation clock starts now.</w:t>
-      </w:r>
-      <w:r>
-        <w:t xml:space="preserve"> </w:t>
-      </w:r>
-      <w:r>
-        <w:rPr>
-          <w:i/>
-          <w:iCs/>
-        </w:rPr>
-        <w:t xml:space="preserve">(The CI pipeline, search-engine exclusion, and documentation refresh from §5.2 were completed the same day as this assessment.)</w:t>
+        <w:t xml:space="preserve">hand the Strapi/Mailgun owners their Phase 1 checklists so the preparation clock starts now — everything else from this section already closed the same day: the linter branch was recovered, pushed, and merged; the CI pipeline is live and green (v0.2.0 released and tagged); and the search-engine exclusion and documentation refresh shipped with it.</w:t>
       </w:r>
     </w:p>
     <w:p>
@@ -6837,7 +6908,7 @@
           <w:b/>
           <w:bCs/>
         </w:rPr>
-        <w:t xml:space="preserve">661 automated tests, all passing</w:t>
+        <w:t xml:space="preserve">677 automated tests, all passing</w:t>
       </w:r>
       <w:r>
         <w:t xml:space="preserve">, re-run automatically on every change (CI).</w:t>
@@ -7233,7 +7304,7 @@
         <w:t xml:space="preserve">0 critical issues, 0 open high or medium</w:t>
       </w:r>
       <w:r>
-        <w:t xml:space="preserve">; the in-repo fixes are done and covered by 661 automated tests, re-run in CI on every change (</w:t>
+        <w:t xml:space="preserve">; the in-repo fixes are done and covered by 677 automated tests, re-run in CI on every change (</w:t>
       </w:r>
       <w:r>
         <w:rPr>
@@ -9708,7 +9779,7 @@
           <w:b/>
           <w:bCs/>
         </w:rPr>
-        <w:t xml:space="preserve">661 automated tests</w:t>
+        <w:t xml:space="preserve">677 automated tests</w:t>
       </w:r>
       <w:r>
         <w:t xml:space="preserve"> </w:t>
@@ -11206,7 +11277,7 @@
           <w:b/>
           <w:bCs/>
         </w:rPr>
-        <w:t xml:space="preserve">661 automated tests, all passing</w:t>
+        <w:t xml:space="preserve">677 automated tests, all passing</w:t>
       </w:r>
       <w:r>
         <w:t xml:space="preserve">, re-run automatically on</w:t>
@@ -14334,7 +14405,7 @@
               <w:pStyle w:val="Compact"/>
             </w:pPr>
             <w:r>
-              <w:t xml:space="preserve">Typecheck + all 661 tests + both builds on every push</w:t>
+              <w:t xml:space="preserve">Typecheck + all 677 tests + both builds on every push</w:t>
             </w:r>
           </w:p>
         </w:tc>
@@ -15700,7 +15771,7 @@
           <w:b/>
           <w:bCs/>
         </w:rPr>
-        <w:t xml:space="preserve">661 automated tests, all passing</w:t>
+        <w:t xml:space="preserve">677 automated tests, all passing</w:t>
       </w:r>
       <w:r>
         <w:t xml:space="preserve">, across the sign-in and roles, the</w:t>
@@ -15917,7 +15988,7 @@
         <w:t xml:space="preserve"> </w:t>
       </w:r>
       <w:r>
-        <w:t xml:space="preserve">directly; the test suite re-checks 661 promises every time the code changes, and</w:t>
+        <w:t xml:space="preserve">directly; the test suite re-checks 677 promises every time the code changes, and</w:t>
       </w:r>
       <w:r>
         <w:t xml:space="preserve"> </w:t>
@@ -16314,7 +16385,7 @@
           <w:b/>
           <w:bCs/>
         </w:rPr>
-        <w:t xml:space="preserve">661</w:t>
+        <w:t xml:space="preserve">677</w:t>
       </w:r>
       <w:r>
         <w:t xml:space="preserve"> </w:t>
@@ -19679,13 +19750,7 @@
         <w:t xml:space="preserve"> </w:t>
       </w:r>
       <w:r>
-        <w:t xml:space="preserve">problems) is implemented and review-approved on a feature branch, awaiting its</w:t>
-      </w:r>
-      <w:r>
-        <w:t xml:space="preserve"> </w:t>
-      </w:r>
-      <w:r>
-        <w:t xml:space="preserve">merge decision.</w:t>
+        <w:t xml:space="preserve">problems, with jump-to-line results) is merged and shipping (2026-07-11).</w:t>
       </w:r>
     </w:p>
     <w:p>
@@ -20824,7 +20889,7 @@
           <w:i/>
           <w:iCs/>
         </w:rPr>
-        <w:t xml:space="preserve">shipped state (661 tests, four audits, annotations/preview/card-view/tour/demo</w:t>
+        <w:t xml:space="preserve">shipped state (677 tests, four audits, annotations/preview/card-view/tour/demo</w:t>
       </w:r>
       <w:r>
         <w:rPr>
@@ -21408,7 +21473,23 @@
         <w:t xml:space="preserve"> </w:t>
       </w:r>
       <w:r>
-        <w:t xml:space="preserve">661 tests / 96 files, all passing; typecheck clean (verified 2026-07-11).</w:t>
+        <w:t xml:space="preserve">661 tests / 96 files at the v0.2.0 release;</w:t>
+      </w:r>
+      <w:r>
+        <w:t xml:space="preserve"> </w:t>
+      </w:r>
+      <w:r>
+        <w:rPr>
+          <w:b/>
+          <w:bCs/>
+        </w:rPr>
+        <w:t xml:space="preserve">677 tests / 97 files</w:t>
+      </w:r>
+      <w:r>
+        <w:t xml:space="preserve"> </w:t>
+      </w:r>
+      <w:r>
+        <w:t xml:space="preserve">after the body-linter branch merge later the same day — all passing, typecheck clean (both verified 2026-07-11).</w:t>
       </w:r>
     </w:p>
     <w:p>

</xml_diff>